<commit_message>
phase(generator): Phase 9 shell — 8-section template, profiles, context contract — 18 files
Co-authored-by: Cursor <cursoragent@cursor.com>
</commit_message>
<xml_diff>
--- a/templates_docx/survey_report.docx
+++ b/templates_docx/survey_report.docx
@@ -26,6 +26,11 @@
       </w:r>
     </w:p>
     <w:p>
+      <w:r>
+        <w:t>Brand color: {{ primary_color }}</w:t>
+      </w:r>
+    </w:p>
+    <w:p>
       <w:pPr>
         <w:pStyle w:val="Heading1"/>
       </w:pPr>
@@ -35,7 +40,7 @@
     </w:p>
     <w:p>
       <w:r>
-        <w:t>This report documents wireless access point installation and survey results for the site named above. Detailed RF configuration and field photos follow. (Placeholder text — replace when Josh's sample deliverable arrives.)</w:t>
+        <w:t>{{ exec_summary }}</w:t>
       </w:r>
     </w:p>
     <w:p>
@@ -43,7 +48,101 @@
         <w:pStyle w:val="Heading1"/>
       </w:pPr>
       <w:r>
-        <w:t>Access Points</w:t>
+        <w:t>Scope / Methodology</w:t>
+      </w:r>
+    </w:p>
+    <w:p>
+      <w:r>
+        <w:t>{{ scope_methodology }}</w:t>
+      </w:r>
+    </w:p>
+    <w:p>
+      <w:r>
+        <w:t>Survey type: {{ survey_type }}</w:t>
+      </w:r>
+    </w:p>
+    <w:p>
+      <w:r>
+        <w:t>Location vertical: {{ location_vertical }}</w:t>
+      </w:r>
+    </w:p>
+    <w:p>
+      <w:r>
+        <w:t>Band plan: {{ band_plan }}</w:t>
+      </w:r>
+    </w:p>
+    <w:p>
+      <w:r>
+        <w:t>Site metadata: {{ site_metadata }}</w:t>
+      </w:r>
+    </w:p>
+    <w:p>
+      <w:pPr>
+        <w:pStyle w:val="Heading1"/>
+      </w:pPr>
+      <w:r>
+        <w:t>Success Criteria</w:t>
+      </w:r>
+    </w:p>
+    <w:p>
+      <w:r>
+        <w:t>Profile: {{ success_criteria.label }} ({{ success_criteria.profile_key }})</w:t>
+      </w:r>
+    </w:p>
+    <w:p>
+      <w:r>
+        <w:t>Min RSSI: {{ success_criteria.min_rssi_dbm }} dBm</w:t>
+      </w:r>
+    </w:p>
+    <w:p>
+      <w:r>
+        <w:t>Min SNR: {{ success_criteria.min_snr_db }} dB</w:t>
+      </w:r>
+    </w:p>
+    <w:p>
+      <w:r>
+        <w:t>Min data rate: {{ success_criteria.min_data_rate_mbps }} Mbps</w:t>
+      </w:r>
+    </w:p>
+    <w:p>
+      <w:r>
+        <w:t>Max co-channel overlap: {{ success_criteria.max_co_channel_aps }} APs</w:t>
+      </w:r>
+    </w:p>
+    <w:p>
+      <w:r>
+        <w:t>Override applied: {{ success_criteria.is_override }}</w:t>
+      </w:r>
+    </w:p>
+    <w:p>
+      <w:pPr>
+        <w:pStyle w:val="Heading1"/>
+      </w:pPr>
+      <w:r>
+        <w:t>Findings</w:t>
+      </w:r>
+    </w:p>
+    <w:p>
+      <w:r>
+        <w:t>{{ findings }}</w:t>
+      </w:r>
+    </w:p>
+    <w:p>
+      <w:r>
+        <w:t>Access points in inventory: {{ ap_count }}</w:t>
+      </w:r>
+    </w:p>
+    <w:p>
+      <w:r>
+        <w:t>Overridden issues: {{ override_count }}</w:t>
+      </w:r>
+    </w:p>
+    <w:p>
+      <w:pPr>
+        <w:pStyle w:val="Heading1"/>
+      </w:pPr>
+      <w:r>
+        <w:t>AP Inventory</w:t>
       </w:r>
     </w:p>
     <w:p>
@@ -68,12 +167,22 @@
     </w:p>
     <w:p>
       <w:r>
-        <w:t>Close: {{ ap.photo_close_label }} {{ ap.photo_close }}</w:t>
+        <w:t>Close: {{ ap.photo_close_label }}</w:t>
       </w:r>
     </w:p>
     <w:p>
       <w:r>
-        <w:t>Far: {{ ap.photo_far_label }} {{ ap.photo_far }}</w:t>
+        <w:t>{{ ap.photo_close }}</w:t>
+      </w:r>
+    </w:p>
+    <w:p>
+      <w:r>
+        <w:t>Far: {{ ap.photo_far_label }}</w:t>
+      </w:r>
+    </w:p>
+    <w:p>
+      <w:r>
+        <w:t>{{ ap.photo_far }}</w:t>
       </w:r>
     </w:p>
     <w:p>
@@ -86,30 +195,12 @@
         <w:pStyle w:val="Heading1"/>
       </w:pPr>
       <w:r>
-        <w:t>Supporting Documents</w:t>
+        <w:t>Issues &amp; Gaps</w:t>
       </w:r>
     </w:p>
     <w:p>
       <w:r>
-        <w:t>{%p for att in attachments %}</w:t>
-      </w:r>
-    </w:p>
-    <w:p>
-      <w:r>
-        <w:t>{% if att.image %}{{ att.filename }}: {{ att.image }}{% else %}{{ att.filename }}{% endif %}</w:t>
-      </w:r>
-    </w:p>
-    <w:p>
-      <w:r>
-        <w:t>{%p endfor %}</w:t>
-      </w:r>
-    </w:p>
-    <w:p>
-      <w:pPr>
-        <w:pStyle w:val="Heading1"/>
-      </w:pPr>
-      <w:r>
-        <w:t>Override Audit</w:t>
+        <w:t>{% if has_overrides %}</w:t>
       </w:r>
     </w:p>
     <w:p>
@@ -120,6 +211,76 @@
     <w:p>
       <w:r>
         <w:t>{{ ov.ap_name }} — {{ ov.type_label }}: {{ ov.detail }} ({{ ov.reason }})</w:t>
+      </w:r>
+    </w:p>
+    <w:p>
+      <w:r>
+        <w:t>{%p endfor %}</w:t>
+      </w:r>
+    </w:p>
+    <w:p>
+      <w:r>
+        <w:t>{% else %}</w:t>
+      </w:r>
+    </w:p>
+    <w:p>
+      <w:r>
+        <w:t>No overridden issues recorded for this job.</w:t>
+      </w:r>
+    </w:p>
+    <w:p>
+      <w:r>
+        <w:t>{% endif %}</w:t>
+      </w:r>
+    </w:p>
+    <w:p>
+      <w:pPr>
+        <w:pStyle w:val="Heading1"/>
+      </w:pPr>
+      <w:r>
+        <w:t>Appendices</w:t>
+      </w:r>
+    </w:p>
+    <w:tbl>
+      <w:tblPr>
+        <w:tblW w:type="auto" w:w="0"/>
+        <w:tblLook w:firstColumn="1" w:firstRow="1" w:lastColumn="0" w:lastRow="0" w:noHBand="0" w:noVBand="1" w:val="04A0"/>
+      </w:tblPr>
+      <w:tblGrid>
+        <w:gridCol w:w="4320"/>
+        <w:gridCol w:w="4320"/>
+      </w:tblGrid>
+      <w:tr>
+        <w:tc>
+          <w:tcPr>
+            <w:tcW w:type="dxa" w:w="4320"/>
+          </w:tcPr>
+          <w:p>
+            <w:r>
+              <w:t>Filename</w:t>
+            </w:r>
+          </w:p>
+        </w:tc>
+        <w:tc>
+          <w:tcPr>
+            <w:tcW w:type="dxa" w:w="4320"/>
+          </w:tcPr>
+          <w:p>
+            <w:r>
+              <w:t>Preview</w:t>
+            </w:r>
+          </w:p>
+        </w:tc>
+      </w:tr>
+    </w:tbl>
+    <w:p>
+      <w:r>
+        <w:t>{%p for att in attachments %}</w:t>
+      </w:r>
+    </w:p>
+    <w:p>
+      <w:r>
+        <w:t>{% if att.image %}{{ att.filename }} | {{ att.image }}{% else %}{{ att.filename }} | (file){% endif %}</w:t>
       </w:r>
     </w:p>
     <w:p>

</xml_diff>